<commit_message>
Simplify 智啟學教 plan for school leadership review.
Remove vendor-specific and technical wording; keep Teams scanning, core group, and EDB commitments.

Co-authored-by: Cursor <cursoragent@cursor.com>
</commit_message>
<xml_diff>
--- a/Administrative/EDB/智啟學教/《「智啟學教」AI學與教發展計劃》計劃書.docx
+++ b/Administrative/EDB/智啟學教/《「智啟學教」AI學與教發展計劃》計劃書.docx
@@ -42,7 +42,7 @@
           <w:b w:val="0"/>
           <w:sz w:val="24"/>
         </w:rPr>
-        <w:t>本校已獲批「『智』啟學教」一筆過 50 萬元撥款。撥款可用期至 2027/28 學年完結（最遲 2028-08-31），亦即實際推展重點落在 2026/27 及 2027/28 兩個學年。</w:t>
+        <w:t>本校已獲批「『智』啟學教」一筆過 50 萬元撥款。撥款可用期至 2027/28 學年完結（最遲 2028-08-31），實際推展重點落在 2026/27 及 2027/28 兩個學年。</w:t>
       </w:r>
     </w:p>
     <w:p>
@@ -52,7 +52,33 @@
           <w:b w:val="0"/>
           <w:sz w:val="24"/>
         </w:rPr>
-        <w:t>參照教育局《中小學數字教育發展藍圖》及通函第 221/2025 號，本校不以「多買幾個平台帳號」為目標，而是聚焦數字教育最難的一步：把課室內學生的紙本學習成果（工作紙、作業、小測等），以最少步驟、最符合校情的方式數碼化，並上載至校本已使用的 Microsoft Teams，再在此基礎上配合人工智能輔助批改、回饋與學情分析。</w:t>
+        <w:t>參照教育局《中小學數字教育發展藍圖》及通函第 221/2025 號，本校不以「多買幾個平台帳號」為目標，而是聚焦兩項校本需要：</w:t>
+      </w:r>
+    </w:p>
+    <w:p>
+      <w:pPr>
+        <w:pStyle w:val="ListNumber"/>
+      </w:pPr>
+      <w:r>
+        <w:rPr>
+          <w:rFonts w:ascii="PMingLiU" w:hAnsi="PMingLiU" w:eastAsia="新細明體"/>
+          <w:b w:val="0"/>
+          <w:sz w:val="24"/>
+        </w:rPr>
+        <w:t>數字教育最難的一步：把課室內學生的紙本學習成果（工作紙、作業、小測等），以最少步驟數碼化，上載至校本已使用的 Microsoft Teams，再配合人工智能輔助教學、回饋與學情分析。</w:t>
+      </w:r>
+    </w:p>
+    <w:p>
+      <w:pPr>
+        <w:pStyle w:val="ListNumber"/>
+      </w:pPr>
+      <w:r>
+        <w:rPr>
+          <w:rFonts w:ascii="PMingLiU" w:hAnsi="PMingLiU" w:eastAsia="新細明體"/>
+          <w:b w:val="0"/>
+          <w:sz w:val="24"/>
+        </w:rPr>
+        <w:t>校本 AI 共建：由小型核心教師團隊，逐步建立可重用的行政及教學支援流程（例如：活動表格、會議紀錄、試卷及評核工具），讓更多同事在 本地電腦 按標準步驟使用，無需依賴中央伺服器，亦無需全校購買 M365 Copilot。</w:t>
       </w:r>
     </w:p>
     <w:p>
@@ -62,7 +88,7 @@
           <w:b w:val="0"/>
           <w:sz w:val="24"/>
         </w:rPr>
-        <w:t>同時，本校推動 School-Agent-OS 校本共建模式：招募約 10 至 15 位 願意投入的同事，訂閱 Cursor 一年，由各科組按自身需要共建校本 Agent 與自動化流程。核心理念是「基礎設施大於 Prompt」——把重複性行政與教學執行工作，沉澱為可重用的工具與流程；教師只需用自然語言描述需要，即可叫 AI 代為完成填表、整理資料、生成資源等任務。</w:t>
+        <w:t>核心理念：把重複性工作變成 可重複、有範本、有紀錄 的校本流程；AI 協助構思與草稿，正式文件按學校格式及規定產出。</w:t>
       </w:r>
     </w:p>
     <w:p>
@@ -92,7 +118,7 @@
           <w:b w:val="0"/>
           <w:sz w:val="24"/>
         </w:rPr>
-        <w:t>建立一套全校可複用的 「紙本 → 掃描 → Teams → AI 輔助」 工作流，並配合 School-Agent-OS 共建機制，讓教師由 AI 工具使用者，逐步成為校本 Agent 的共建者，最終達致「AI for ALL subjects」。</w:t>
+        <w:t>建立全校可複用的 「紙本 → 掃描 → Teams → AI 輔助」 工作流，並配合校本 AI 共建機制，逐步達致「AI for ALL subjects」。</w:t>
       </w:r>
     </w:p>
     <w:p>
@@ -102,7 +128,7 @@
           <w:b/>
           <w:sz w:val="24"/>
         </w:rPr>
-        <w:t>2.2 雙軌策略</w:t>
+        <w:t>2.2 三軌策略</w:t>
       </w:r>
     </w:p>
     <w:tbl>
@@ -161,7 +187,7 @@
                 <w:b/>
                 <w:sz w:val="24"/>
               </w:rPr>
-              <w:t>目的</w:t>
+              <w:t>對象</w:t>
             </w:r>
           </w:p>
         </w:tc>
@@ -179,7 +205,7 @@
                 <w:b w:val="0"/>
                 <w:sz w:val="24"/>
               </w:rPr>
-              <w:t>A. 紙本數碼化與 Teams 整合</w:t>
+              <w:t>A. 紙本數碼化 + Teams</w:t>
             </w:r>
           </w:p>
         </w:tc>
@@ -195,7 +221,7 @@
                 <w:b w:val="0"/>
                 <w:sz w:val="24"/>
               </w:rPr>
-              <w:t>購置不同場景適用的掃描設備，建立標準上載流程</w:t>
+              <w:t>掃描設備、上載標準流程、試點科推行</w:t>
             </w:r>
           </w:p>
         </w:tc>
@@ -211,7 +237,7 @@
                 <w:b w:val="0"/>
                 <w:sz w:val="24"/>
               </w:rPr>
-              <w:t>解決「學生紙本功課難以上平台」的瓶頸</w:t>
+              <w:t>全校教師（尤其英/數/音）</w:t>
             </w:r>
           </w:p>
         </w:tc>
@@ -229,7 +255,7 @@
                 <w:b w:val="0"/>
                 <w:sz w:val="24"/>
               </w:rPr>
-              <w:t>B. Cursor 共建 School-Agent</w:t>
+              <w:t>B. 核心共建</w:t>
             </w:r>
           </w:p>
         </w:tc>
@@ -245,7 +271,7 @@
                 <w:b w:val="0"/>
                 <w:sz w:val="24"/>
               </w:rPr>
-              <w:t>12–15 位共建教師 + Cursor 一年訂閱</w:t>
+              <w:t>4–5 人核心組，以 AI 輔助工具開發及整理校本流程</w:t>
             </w:r>
           </w:p>
         </w:tc>
@@ -261,7 +287,57 @@
                 <w:b w:val="0"/>
                 <w:sz w:val="24"/>
               </w:rPr>
-              <w:t>各科按需要開發 Agent／自動化腳本，長遠減輕行政與教學負擔</w:t>
+              <w:t>核心共建教師</w:t>
+            </w:r>
+          </w:p>
+        </w:tc>
+      </w:tr>
+      <w:tr>
+        <w:tc>
+          <w:tcPr>
+            <w:tcW w:type="dxa" w:w="3009"/>
+          </w:tcPr>
+          <w:p>
+            <w:r/>
+            <w:r>
+              <w:rPr>
+                <w:rFonts w:ascii="PMingLiU" w:hAnsi="PMingLiU" w:eastAsia="新細明體"/>
+                <w:b w:val="0"/>
+                <w:sz w:val="24"/>
+              </w:rPr>
+              <w:t>C. 教師日常使用</w:t>
+            </w:r>
+          </w:p>
+        </w:tc>
+        <w:tc>
+          <w:tcPr>
+            <w:tcW w:type="dxa" w:w="3009"/>
+          </w:tcPr>
+          <w:p>
+            <w:r/>
+            <w:r>
+              <w:rPr>
+                <w:rFonts w:ascii="PMingLiU" w:hAnsi="PMingLiU" w:eastAsia="新細明體"/>
+                <w:b w:val="0"/>
+                <w:sz w:val="24"/>
+              </w:rPr>
+              <w:t>按中文 SOP 使用已建立的校本工具；掃描上載 Teams</w:t>
+            </w:r>
+          </w:p>
+        </w:tc>
+        <w:tc>
+          <w:tcPr>
+            <w:tcW w:type="dxa" w:w="3009"/>
+          </w:tcPr>
+          <w:p>
+            <w:r/>
+            <w:r>
+              <w:rPr>
+                <w:rFonts w:ascii="PMingLiU" w:hAnsi="PMingLiU" w:eastAsia="新細明體"/>
+                <w:b w:val="0"/>
+                <w:sz w:val="24"/>
+              </w:rPr>
+              <w:t>普通教師</w:t>
             </w:r>
           </w:p>
         </w:tc>
@@ -275,121 +351,6 @@
           <w:sz w:val="24"/>
         </w:rPr>
         <w:t>2.3 平台定位</w:t>
-      </w:r>
-    </w:p>
-    <w:p>
-      <w:pPr>
-        <w:pStyle w:val="ListBullet"/>
-      </w:pPr>
-      <w:r>
-        <w:rPr>
-          <w:rFonts w:ascii="PMingLiU" w:hAnsi="PMingLiU" w:eastAsia="新細明體"/>
-          <w:b w:val="0"/>
-          <w:sz w:val="24"/>
-        </w:rPr>
-        <w:t>主平台：Microsoft Teams（校本現有 M365 環境，學生作業、檔案、批改回饋均集中於 Teams）</w:t>
-      </w:r>
-    </w:p>
-    <w:p>
-      <w:pPr>
-        <w:pStyle w:val="ListBullet"/>
-      </w:pPr>
-      <w:r>
-        <w:rPr>
-          <w:rFonts w:ascii="PMingLiU" w:hAnsi="PMingLiU" w:eastAsia="新細明體"/>
-          <w:b w:val="0"/>
-          <w:sz w:val="24"/>
-        </w:rPr>
-        <w:t>不再採用 Sayo.ai 作為本計劃核心平台</w:t>
-      </w:r>
-    </w:p>
-    <w:p>
-      <w:pPr>
-        <w:pStyle w:val="ListBullet"/>
-      </w:pPr>
-      <w:r>
-        <w:rPr>
-          <w:rFonts w:ascii="PMingLiU" w:hAnsi="PMingLiU" w:eastAsia="新細明體"/>
-          <w:b w:val="0"/>
-          <w:sz w:val="24"/>
-        </w:rPr>
-        <w:t>Cursor 及校本 Agent 工具作為 教師端共建與流程自動化 的開發環境，而非取代 Teams 作為學生學習平台</w:t>
-      </w:r>
-    </w:p>
-    <w:p>
-      <w:r>
-        <w:rPr>
-          <w:rFonts w:ascii="PMingLiU" w:hAnsi="PMingLiU" w:eastAsia="新細明體"/>
-          <w:b/>
-          <w:sz w:val="24"/>
-        </w:rPr>
-        <w:t>三、School-Agent-OS 共建計劃</w:t>
-      </w:r>
-    </w:p>
-    <w:p>
-      <w:r>
-        <w:rPr>
-          <w:rFonts w:ascii="PMingLiU" w:hAnsi="PMingLiU" w:eastAsia="新細明體"/>
-          <w:b/>
-          <w:sz w:val="24"/>
-        </w:rPr>
-        <w:t>3.1 共建模式</w:t>
-      </w:r>
-    </w:p>
-    <w:p>
-      <w:r>
-        <w:rPr>
-          <w:rFonts w:ascii="PMingLiU" w:hAnsi="PMingLiU" w:eastAsia="新細明體"/>
-          <w:b w:val="0"/>
-          <w:sz w:val="24"/>
-        </w:rPr>
-        <w:t>School-Agent-OS 把學校工作分為兩層：</w:t>
-      </w:r>
-    </w:p>
-    <w:p>
-      <w:pPr>
-        <w:pStyle w:val="ListBullet"/>
-      </w:pPr>
-      <w:r>
-        <w:rPr>
-          <w:rFonts w:ascii="PMingLiU" w:hAnsi="PMingLiU" w:eastAsia="新細明體"/>
-          <w:b w:val="0"/>
-          <w:sz w:val="24"/>
-        </w:rPr>
-        <w:t>思考層：教師／科組定義需求（例如：如何把紙本小測結果整理成 Teams 可批改格式）</w:t>
-      </w:r>
-    </w:p>
-    <w:p>
-      <w:pPr>
-        <w:pStyle w:val="ListBullet"/>
-      </w:pPr>
-      <w:r>
-        <w:rPr>
-          <w:rFonts w:ascii="PMingLiU" w:hAnsi="PMingLiU" w:eastAsia="新細明體"/>
-          <w:b w:val="0"/>
-          <w:sz w:val="24"/>
-        </w:rPr>
-        <w:t>執行層：透過 Cursor 及 `shared-tools/` 內可重用腳本，由 AI 按結構化規格完成具體操作</w:t>
-      </w:r>
-    </w:p>
-    <w:p>
-      <w:r>
-        <w:rPr>
-          <w:rFonts w:ascii="PMingLiU" w:hAnsi="PMingLiU" w:eastAsia="新細明體"/>
-          <w:b w:val="0"/>
-          <w:sz w:val="24"/>
-        </w:rPr>
-        <w:t>此模式已在 repo 內試行（試卷生成、會議紀錄、活動表格、評核工具等），本計劃將之校本化、科組化。</w:t>
-      </w:r>
-    </w:p>
-    <w:p>
-      <w:r>
-        <w:rPr>
-          <w:rFonts w:ascii="PMingLiU" w:hAnsi="PMingLiU" w:eastAsia="新細明體"/>
-          <w:b/>
-          <w:sz w:val="24"/>
-        </w:rPr>
-        <w:t>3.2 共建教師隊伍（目標 10–15 人）</w:t>
       </w:r>
     </w:p>
     <w:tbl>
@@ -416,7 +377,298 @@
                 <w:b/>
                 <w:sz w:val="24"/>
               </w:rPr>
-              <w:t>組別</w:t>
+              <w:t>用途</w:t>
+            </w:r>
+          </w:p>
+        </w:tc>
+        <w:tc>
+          <w:tcPr>
+            <w:tcW w:type="dxa" w:w="3009"/>
+          </w:tcPr>
+          <w:p>
+            <w:r/>
+            <w:r>
+              <w:rPr>
+                <w:rFonts w:ascii="PMingLiU" w:hAnsi="PMingLiU" w:eastAsia="新細明體"/>
+                <w:b/>
+                <w:sz w:val="24"/>
+              </w:rPr>
+              <w:t>選型</w:t>
+            </w:r>
+          </w:p>
+        </w:tc>
+        <w:tc>
+          <w:tcPr>
+            <w:tcW w:type="dxa" w:w="3009"/>
+          </w:tcPr>
+          <w:p>
+            <w:r/>
+            <w:r>
+              <w:rPr>
+                <w:rFonts w:ascii="PMingLiU" w:hAnsi="PMingLiU" w:eastAsia="新細明體"/>
+                <w:b/>
+                <w:sz w:val="24"/>
+              </w:rPr>
+              <w:t>說明</w:t>
+            </w:r>
+          </w:p>
+        </w:tc>
+      </w:tr>
+      <w:tr>
+        <w:tc>
+          <w:tcPr>
+            <w:tcW w:type="dxa" w:w="3009"/>
+          </w:tcPr>
+          <w:p>
+            <w:r/>
+            <w:r>
+              <w:rPr>
+                <w:rFonts w:ascii="PMingLiU" w:hAnsi="PMingLiU" w:eastAsia="新細明體"/>
+                <w:b w:val="0"/>
+                <w:sz w:val="24"/>
+              </w:rPr>
+              <w:t>學生學習與交功課</w:t>
+            </w:r>
+          </w:p>
+        </w:tc>
+        <w:tc>
+          <w:tcPr>
+            <w:tcW w:type="dxa" w:w="3009"/>
+          </w:tcPr>
+          <w:p>
+            <w:r/>
+            <w:r>
+              <w:rPr>
+                <w:rFonts w:ascii="PMingLiU" w:hAnsi="PMingLiU" w:eastAsia="新細明體"/>
+                <w:b w:val="0"/>
+                <w:sz w:val="24"/>
+              </w:rPr>
+              <w:t>Microsoft Teams</w:t>
+            </w:r>
+          </w:p>
+        </w:tc>
+        <w:tc>
+          <w:tcPr>
+            <w:tcW w:type="dxa" w:w="3009"/>
+          </w:tcPr>
+          <w:p>
+            <w:r/>
+            <w:r>
+              <w:rPr>
+                <w:rFonts w:ascii="PMingLiU" w:hAnsi="PMingLiU" w:eastAsia="新細明體"/>
+                <w:b w:val="0"/>
+                <w:sz w:val="24"/>
+              </w:rPr>
+              <w:t>作業、檔案、回饋集中於 M365</w:t>
+            </w:r>
+          </w:p>
+        </w:tc>
+      </w:tr>
+      <w:tr>
+        <w:tc>
+          <w:tcPr>
+            <w:tcW w:type="dxa" w:w="3009"/>
+          </w:tcPr>
+          <w:p>
+            <w:r/>
+            <w:r>
+              <w:rPr>
+                <w:rFonts w:ascii="PMingLiU" w:hAnsi="PMingLiU" w:eastAsia="新細明體"/>
+                <w:b w:val="0"/>
+                <w:sz w:val="24"/>
+              </w:rPr>
+              <w:t>核心組開發與共建</w:t>
+            </w:r>
+          </w:p>
+        </w:tc>
+        <w:tc>
+          <w:tcPr>
+            <w:tcW w:type="dxa" w:w="3009"/>
+          </w:tcPr>
+          <w:p>
+            <w:r/>
+            <w:r>
+              <w:rPr>
+                <w:rFonts w:ascii="PMingLiU" w:hAnsi="PMingLiU" w:eastAsia="新細明體"/>
+                <w:b w:val="0"/>
+                <w:sz w:val="24"/>
+              </w:rPr>
+              <w:t>Cursor（3–4 席）</w:t>
+            </w:r>
+          </w:p>
+        </w:tc>
+        <w:tc>
+          <w:tcPr>
+            <w:tcW w:type="dxa" w:w="3009"/>
+          </w:tcPr>
+          <w:p>
+            <w:r/>
+            <w:r>
+              <w:rPr>
+                <w:rFonts w:ascii="PMingLiU" w:hAnsi="PMingLiU" w:eastAsia="新細明體"/>
+                <w:b w:val="0"/>
+                <w:sz w:val="24"/>
+              </w:rPr>
+              <w:t>核心教師建立及維護校本自動化流程</w:t>
+            </w:r>
+          </w:p>
+        </w:tc>
+      </w:tr>
+      <w:tr>
+        <w:tc>
+          <w:tcPr>
+            <w:tcW w:type="dxa" w:w="3009"/>
+          </w:tcPr>
+          <w:p>
+            <w:r/>
+            <w:r>
+              <w:rPr>
+                <w:rFonts w:ascii="PMingLiU" w:hAnsi="PMingLiU" w:eastAsia="新細明體"/>
+                <w:b w:val="0"/>
+                <w:sz w:val="24"/>
+              </w:rPr>
+              <w:t>教師日常 AI 輔助（可選）</w:t>
+            </w:r>
+          </w:p>
+        </w:tc>
+        <w:tc>
+          <w:tcPr>
+            <w:tcW w:type="dxa" w:w="3009"/>
+          </w:tcPr>
+          <w:p>
+            <w:r/>
+            <w:r>
+              <w:rPr>
+                <w:rFonts w:ascii="PMingLiU" w:hAnsi="PMingLiU" w:eastAsia="新細明體"/>
+                <w:b w:val="0"/>
+                <w:sz w:val="24"/>
+              </w:rPr>
+              <w:t>合規、低成本工具</w:t>
+            </w:r>
+          </w:p>
+        </w:tc>
+        <w:tc>
+          <w:tcPr>
+            <w:tcW w:type="dxa" w:w="3009"/>
+          </w:tcPr>
+          <w:p>
+            <w:r/>
+            <w:r>
+              <w:rPr>
+                <w:rFonts w:ascii="PMingLiU" w:hAnsi="PMingLiU" w:eastAsia="新細明體"/>
+                <w:b w:val="0"/>
+                <w:sz w:val="24"/>
+              </w:rPr>
+              <w:t>例如 Gemini 等，用於草稿及問答；不處理學生個人資料、不出正式檔</w:t>
+            </w:r>
+          </w:p>
+        </w:tc>
+      </w:tr>
+    </w:tbl>
+    <w:p>
+      <w:r>
+        <w:rPr>
+          <w:rFonts w:ascii="PMingLiU" w:hAnsi="PMingLiU" w:eastAsia="新細明體"/>
+          <w:b/>
+          <w:sz w:val="24"/>
+        </w:rPr>
+        <w:t>三、校本 AI 共建安排</w:t>
+      </w:r>
+    </w:p>
+    <w:p>
+      <w:r>
+        <w:rPr>
+          <w:rFonts w:ascii="PMingLiU" w:hAnsi="PMingLiU" w:eastAsia="新細明體"/>
+          <w:b/>
+          <w:sz w:val="24"/>
+        </w:rPr>
+        <w:t>3.1 分工概覽</w:t>
+      </w:r>
+    </w:p>
+    <w:p>
+      <w:pPr>
+        <w:pStyle w:val="ListBullet"/>
+      </w:pPr>
+      <w:r>
+        <w:rPr>
+          <w:rFonts w:ascii="PMingLiU" w:hAnsi="PMingLiU" w:eastAsia="新細明體"/>
+          <w:b w:val="0"/>
+          <w:sz w:val="24"/>
+        </w:rPr>
+        <w:t>核心組（4–5 人）：按科組及行政需要，建立及更新校本工具與標準流程（活動表、會議紀錄、評核支援等）。</w:t>
+      </w:r>
+    </w:p>
+    <w:p>
+      <w:pPr>
+        <w:pStyle w:val="ListBullet"/>
+      </w:pPr>
+      <w:r>
+        <w:rPr>
+          <w:rFonts w:ascii="PMingLiU" w:hAnsi="PMingLiU" w:eastAsia="新細明體"/>
+          <w:b w:val="0"/>
+          <w:sz w:val="24"/>
+        </w:rPr>
+        <w:t>普通教師：按 中文 SOP 使用已發佈的流程；掃描及上載 Teams；有需要時向核心組提出新需求。</w:t>
+      </w:r>
+    </w:p>
+    <w:p>
+      <w:pPr>
+        <w:pStyle w:val="ListBullet"/>
+      </w:pPr>
+      <w:r>
+        <w:rPr>
+          <w:rFonts w:ascii="PMingLiU" w:hAnsi="PMingLiU" w:eastAsia="新細明體"/>
+          <w:b w:val="0"/>
+          <w:sz w:val="24"/>
+        </w:rPr>
+        <w:t>正式文件（校務表格、試卷、會議紀錄等）：須按學校範本及既定步驟產出，確保格式一致、可存檔、可審核。</w:t>
+      </w:r>
+    </w:p>
+    <w:p>
+      <w:r>
+        <w:rPr>
+          <w:rFonts w:ascii="PMingLiU" w:hAnsi="PMingLiU" w:eastAsia="新細明體"/>
+          <w:b w:val="0"/>
+          <w:sz w:val="24"/>
+        </w:rPr>
+        <w:t>本校已在部分工作試行相關做法（例如試卷整理、會議紀錄、活動申請表等），本計劃將之擴展至試點科及更多同事。</w:t>
+      </w:r>
+    </w:p>
+    <w:p>
+      <w:r>
+        <w:rPr>
+          <w:rFonts w:ascii="PMingLiU" w:hAnsi="PMingLiU" w:eastAsia="新細明體"/>
+          <w:b/>
+          <w:sz w:val="24"/>
+        </w:rPr>
+        <w:t>3.2 核心共建組（4–5 人，2026/27 學年）</w:t>
+      </w:r>
+    </w:p>
+    <w:tbl>
+      <w:tblPr>
+        <w:tblStyle w:val="TableGrid"/>
+        <w:tblW w:type="auto" w:w="0"/>
+        <w:tblLook w:firstColumn="1" w:firstRow="1" w:lastColumn="0" w:lastRow="0" w:noHBand="0" w:noVBand="1" w:val="04A0"/>
+      </w:tblPr>
+      <w:tblGrid>
+        <w:gridCol w:w="3009"/>
+        <w:gridCol w:w="3009"/>
+        <w:gridCol w:w="3009"/>
+      </w:tblGrid>
+      <w:tr>
+        <w:tc>
+          <w:tcPr>
+            <w:tcW w:type="dxa" w:w="3009"/>
+          </w:tcPr>
+          <w:p>
+            <w:r/>
+            <w:r>
+              <w:rPr>
+                <w:rFonts w:ascii="PMingLiU" w:hAnsi="PMingLiU" w:eastAsia="新細明體"/>
+                <w:b/>
+                <w:sz w:val="24"/>
+              </w:rPr>
+              <w:t>角色</w:t>
             </w:r>
           </w:p>
         </w:tc>
@@ -448,7 +700,7 @@
                 <w:b/>
                 <w:sz w:val="24"/>
               </w:rPr>
-              <w:t>角色</w:t>
+              <w:t>職責</w:t>
             </w:r>
           </w:p>
         </w:tc>
@@ -466,7 +718,7 @@
                 <w:b w:val="0"/>
                 <w:sz w:val="24"/>
               </w:rPr>
-              <w:t>核心試點科（英文、數學、音樂）</w:t>
+              <w:t>計劃統籌</w:t>
             </w:r>
           </w:p>
         </w:tc>
@@ -482,7 +734,7 @@
                 <w:b w:val="0"/>
                 <w:sz w:val="24"/>
               </w:rPr>
-              <w:t>各 2–3 人</w:t>
+              <w:t>1</w:t>
             </w:r>
           </w:p>
         </w:tc>
@@ -498,7 +750,7 @@
                 <w:b w:val="0"/>
                 <w:sz w:val="24"/>
               </w:rPr>
-              <w:t>必須參與，負責達成教育局剛性指標</w:t>
+              <w:t>整體規劃、對外匯報、與 IT 協調</w:t>
             </w:r>
           </w:p>
         </w:tc>
@@ -516,7 +768,7 @@
                 <w:b w:val="0"/>
                 <w:sz w:val="24"/>
               </w:rPr>
-              <w:t>自願共建教師（其他科組）</w:t>
+              <w:t>試點科代表（英/數/音）</w:t>
             </w:r>
           </w:p>
         </w:tc>
@@ -532,7 +784,7 @@
                 <w:b w:val="0"/>
                 <w:sz w:val="24"/>
               </w:rPr>
-              <w:t>6–8 人</w:t>
+              <w:t>2–3</w:t>
             </w:r>
           </w:p>
         </w:tc>
@@ -548,7 +800,7 @@
                 <w:b w:val="0"/>
                 <w:sz w:val="24"/>
               </w:rPr>
-              <w:t>按科組需要開發 Agent（填表、資料整理、資源製作等）</w:t>
+              <w:t>達成教育局剛性指標；各科應用例子</w:t>
             </w:r>
           </w:p>
         </w:tc>
@@ -566,7 +818,7 @@
                 <w:b w:val="0"/>
                 <w:sz w:val="24"/>
               </w:rPr>
-              <w:t>技術統籌（Tech Director）</w:t>
+              <w:t>行政/記錄</w:t>
             </w:r>
           </w:p>
         </w:tc>
@@ -582,7 +834,7 @@
                 <w:b w:val="0"/>
                 <w:sz w:val="24"/>
               </w:rPr>
-              <w:t>1 人</w:t>
+              <w:t>1</w:t>
             </w:r>
           </w:p>
         </w:tc>
@@ -598,7 +850,7 @@
                 <w:b w:val="0"/>
                 <w:sz w:val="24"/>
               </w:rPr>
-              <w:t>訂立共用規格、把個別 Agent 整合入 School-Agent-OS</w:t>
+              <w:t>撰寫 SOP、培訓支援、會議紀錄</w:t>
             </w:r>
           </w:p>
         </w:tc>
@@ -611,7 +863,17 @@
           <w:b w:val="0"/>
           <w:sz w:val="24"/>
         </w:rPr>
-        <w:t>招募方式：Staff Meeting 公開招募「有心共建者」，須經科主任同意後加入。</w:t>
+        <w:t>今年要求：核心組 每週短會（約 15 分鐘），彼此知悉進度；各項工作有清單及紀錄，確保 不依賴單一同事 方可延續。</w:t>
+      </w:r>
+    </w:p>
+    <w:p>
+      <w:r>
+        <w:rPr>
+          <w:rFonts w:ascii="PMingLiU" w:hAnsi="PMingLiU" w:eastAsia="新細明體"/>
+          <w:b w:val="0"/>
+          <w:sz w:val="24"/>
+        </w:rPr>
+        <w:t>招募：Staff Meeting 公開招募；須經科主任同意。</w:t>
       </w:r>
     </w:p>
     <w:p>
@@ -621,7 +883,7 @@
           <w:b/>
           <w:sz w:val="24"/>
         </w:rPr>
-        <w:t>3.3 Cursor 訂閱安排</w:t>
+        <w:t>3.3 Cursor 訂閱（核心組專用）</w:t>
       </w:r>
     </w:p>
     <w:p>
@@ -634,7 +896,7 @@
           <w:b w:val="0"/>
           <w:sz w:val="24"/>
         </w:rPr>
-        <w:t>為 12 至 15 位 共建教師購買 Cursor Team / Business 一年訂閱</w:t>
+        <w:t>為 3–4 位 核心共建教師購買 Cursor 一年訂閱（按報價選擇合適方案）</w:t>
       </w:r>
     </w:p>
     <w:p>
@@ -647,7 +909,7 @@
           <w:b w:val="0"/>
           <w:sz w:val="24"/>
         </w:rPr>
-        <w:t>撥款用途：屬「推動人工智能輔助教學的軟件／校本人工智能應用方案」範疇</w:t>
+        <w:t>用途：協助建立校本自動化流程及教學支援工具；非 要求全校教師安裝</w:t>
       </w:r>
     </w:p>
     <w:p>
@@ -660,17 +922,7 @@
           <w:b w:val="0"/>
           <w:sz w:val="24"/>
         </w:rPr>
-        <w:t>不用撥款支付教師 AI 培訓課程（按運用指引）；教師技能透過共建實戰、科組互教及教育局提供的免費培訓建立</w:t>
-      </w:r>
-    </w:p>
-    <w:p>
-      <w:r>
-        <w:rPr>
-          <w:rFonts w:ascii="PMingLiU" w:hAnsi="PMingLiU" w:eastAsia="新細明體"/>
-          <w:b/>
-          <w:sz w:val="24"/>
-        </w:rPr>
-        <w:t>3.4 共建教師可做的 Agent 例子</w:t>
+        <w:t>撥款屬「校本人工智能應用方案／軟件」範疇</w:t>
       </w:r>
     </w:p>
     <w:p>
@@ -683,61 +935,488 @@
           <w:b w:val="0"/>
           <w:sz w:val="24"/>
         </w:rPr>
-        <w:t>會議紀錄 → 結構化科組紀錄</w:t>
+        <w:t>不用撥款支付教師 AI 培訓課程（按運用指引）</w:t>
       </w:r>
     </w:p>
     <w:p>
-      <w:pPr>
-        <w:pStyle w:val="ListBullet"/>
-      </w:pPr>
       <w:r>
         <w:rPr>
           <w:rFonts w:ascii="PMingLiU" w:hAnsi="PMingLiU" w:eastAsia="新細明體"/>
-          <w:b w:val="0"/>
+          <w:b/>
           <w:sz w:val="24"/>
         </w:rPr>
-        <w:t>活動表格／通告 → 自動填寫 DOCX 範本</w:t>
+        <w:t>3.4 普通教師如何使用</w:t>
       </w:r>
     </w:p>
+    <w:tbl>
+      <w:tblPr>
+        <w:tblStyle w:val="TableGrid"/>
+        <w:tblW w:type="auto" w:w="0"/>
+        <w:tblLook w:firstColumn="1" w:firstRow="1" w:lastColumn="0" w:lastRow="0" w:noHBand="0" w:noVBand="1" w:val="04A0"/>
+      </w:tblPr>
+      <w:tblGrid>
+        <w:gridCol w:w="4513"/>
+        <w:gridCol w:w="4513"/>
+      </w:tblGrid>
+      <w:tr>
+        <w:tc>
+          <w:tcPr>
+            <w:tcW w:type="dxa" w:w="4513"/>
+          </w:tcPr>
+          <w:p>
+            <w:r/>
+            <w:r>
+              <w:rPr>
+                <w:rFonts w:ascii="PMingLiU" w:hAnsi="PMingLiU" w:eastAsia="新細明體"/>
+                <w:b/>
+                <w:sz w:val="24"/>
+              </w:rPr>
+              <w:t>方式</w:t>
+            </w:r>
+          </w:p>
+        </w:tc>
+        <w:tc>
+          <w:tcPr>
+            <w:tcW w:type="dxa" w:w="4513"/>
+          </w:tcPr>
+          <w:p>
+            <w:r/>
+            <w:r>
+              <w:rPr>
+                <w:rFonts w:ascii="PMingLiU" w:hAnsi="PMingLiU" w:eastAsia="新細明體"/>
+                <w:b/>
+                <w:sz w:val="24"/>
+              </w:rPr>
+              <w:t>說明</w:t>
+            </w:r>
+          </w:p>
+        </w:tc>
+      </w:tr>
+      <w:tr>
+        <w:tc>
+          <w:tcPr>
+            <w:tcW w:type="dxa" w:w="4513"/>
+          </w:tcPr>
+          <w:p>
+            <w:r/>
+            <w:r>
+              <w:rPr>
+                <w:rFonts w:ascii="PMingLiU" w:hAnsi="PMingLiU" w:eastAsia="新細明體"/>
+                <w:b w:val="0"/>
+                <w:sz w:val="24"/>
+              </w:rPr>
+              <w:t>Teams + 掃描 SOP</w:t>
+            </w:r>
+          </w:p>
+        </w:tc>
+        <w:tc>
+          <w:tcPr>
+            <w:tcW w:type="dxa" w:w="4513"/>
+          </w:tcPr>
+          <w:p>
+            <w:r/>
+            <w:r>
+              <w:rPr>
+                <w:rFonts w:ascii="PMingLiU" w:hAnsi="PMingLiU" w:eastAsia="新細明體"/>
+                <w:b w:val="0"/>
+                <w:sz w:val="24"/>
+              </w:rPr>
+              <w:t>上載紙本功課、查閱及回饋（所有教師）</w:t>
+            </w:r>
+          </w:p>
+        </w:tc>
+      </w:tr>
+      <w:tr>
+        <w:tc>
+          <w:tcPr>
+            <w:tcW w:type="dxa" w:w="4513"/>
+          </w:tcPr>
+          <w:p>
+            <w:r/>
+            <w:r>
+              <w:rPr>
+                <w:rFonts w:ascii="PMingLiU" w:hAnsi="PMingLiU" w:eastAsia="新細明體"/>
+                <w:b w:val="0"/>
+                <w:sz w:val="24"/>
+              </w:rPr>
+              <w:t>校本工具</w:t>
+            </w:r>
+          </w:p>
+        </w:tc>
+        <w:tc>
+          <w:tcPr>
+            <w:tcW w:type="dxa" w:w="4513"/>
+          </w:tcPr>
+          <w:p>
+            <w:r/>
+            <w:r>
+              <w:rPr>
+                <w:rFonts w:ascii="PMingLiU" w:hAnsi="PMingLiU" w:eastAsia="新細明體"/>
+                <w:b w:val="0"/>
+                <w:sz w:val="24"/>
+              </w:rPr>
+              <w:t>按 SOP 使用核心組已建立的功能（如填活動表、整理會議紀錄）</w:t>
+            </w:r>
+          </w:p>
+        </w:tc>
+      </w:tr>
+      <w:tr>
+        <w:tc>
+          <w:tcPr>
+            <w:tcW w:type="dxa" w:w="4513"/>
+          </w:tcPr>
+          <w:p>
+            <w:r/>
+            <w:r>
+              <w:rPr>
+                <w:rFonts w:ascii="PMingLiU" w:hAnsi="PMingLiU" w:eastAsia="新細明體"/>
+                <w:b w:val="0"/>
+                <w:sz w:val="24"/>
+              </w:rPr>
+              <w:t>提出新需求</w:t>
+            </w:r>
+          </w:p>
+        </w:tc>
+        <w:tc>
+          <w:tcPr>
+            <w:tcW w:type="dxa" w:w="4513"/>
+          </w:tcPr>
+          <w:p>
+            <w:r/>
+            <w:r>
+              <w:rPr>
+                <w:rFonts w:ascii="PMingLiU" w:hAnsi="PMingLiU" w:eastAsia="新細明體"/>
+                <w:b w:val="0"/>
+                <w:sz w:val="24"/>
+              </w:rPr>
+              <w:t>經 Teams 或科組會議向核心組反映，排期開發</w:t>
+            </w:r>
+          </w:p>
+        </w:tc>
+      </w:tr>
+    </w:tbl>
     <w:p>
-      <w:pPr>
-        <w:pStyle w:val="ListBullet"/>
-      </w:pPr>
       <w:r>
         <w:rPr>
           <w:rFonts w:ascii="PMingLiU" w:hAnsi="PMingLiU" w:eastAsia="新細明體"/>
-          <w:b w:val="0"/>
+          <w:b/>
           <w:sz w:val="24"/>
         </w:rPr>
-        <w:t>紙本掃描檔 → 按班別/學號整理並上載 Teams 指定資料夾</w:t>
+        <w:t>3.5 優先建立的校本應用（初稿）</w:t>
       </w:r>
     </w:p>
-    <w:p>
-      <w:pPr>
-        <w:pStyle w:val="ListBullet"/>
-      </w:pPr>
-      <w:r>
-        <w:rPr>
-          <w:rFonts w:ascii="PMingLiU" w:hAnsi="PMingLiU" w:eastAsia="新細明體"/>
-          <w:b w:val="0"/>
-          <w:sz w:val="24"/>
-        </w:rPr>
-        <w:t>批改結果 → 按評分準則生成分項回饋草稿</w:t>
-      </w:r>
-    </w:p>
-    <w:p>
-      <w:pPr>
-        <w:pStyle w:val="ListBullet"/>
-      </w:pPr>
-      <w:r>
-        <w:rPr>
-          <w:rFonts w:ascii="PMingLiU" w:hAnsi="PMingLiU" w:eastAsia="新細明體"/>
-          <w:b w:val="0"/>
-          <w:sz w:val="24"/>
-        </w:rPr>
-        <w:t>科組 Excel 報表 → 自動匯入教育局格式</w:t>
-      </w:r>
-    </w:p>
+    <w:tbl>
+      <w:tblPr>
+        <w:tblStyle w:val="TableGrid"/>
+        <w:tblW w:type="auto" w:w="0"/>
+        <w:tblLook w:firstColumn="1" w:firstRow="1" w:lastColumn="0" w:lastRow="0" w:noHBand="0" w:noVBand="1" w:val="04A0"/>
+      </w:tblPr>
+      <w:tblGrid>
+        <w:gridCol w:w="3009"/>
+        <w:gridCol w:w="3009"/>
+        <w:gridCol w:w="3009"/>
+      </w:tblGrid>
+      <w:tr>
+        <w:tc>
+          <w:tcPr>
+            <w:tcW w:type="dxa" w:w="3009"/>
+          </w:tcPr>
+          <w:p>
+            <w:r/>
+            <w:r>
+              <w:rPr>
+                <w:rFonts w:ascii="PMingLiU" w:hAnsi="PMingLiU" w:eastAsia="新細明體"/>
+                <w:b/>
+                <w:sz w:val="24"/>
+              </w:rPr>
+              <w:t>優先級</w:t>
+            </w:r>
+          </w:p>
+        </w:tc>
+        <w:tc>
+          <w:tcPr>
+            <w:tcW w:type="dxa" w:w="3009"/>
+          </w:tcPr>
+          <w:p>
+            <w:r/>
+            <w:r>
+              <w:rPr>
+                <w:rFonts w:ascii="PMingLiU" w:hAnsi="PMingLiU" w:eastAsia="新細明體"/>
+                <w:b/>
+                <w:sz w:val="24"/>
+              </w:rPr>
+              <w:t>應用方向</w:t>
+            </w:r>
+          </w:p>
+        </w:tc>
+        <w:tc>
+          <w:tcPr>
+            <w:tcW w:type="dxa" w:w="3009"/>
+          </w:tcPr>
+          <w:p>
+            <w:r/>
+            <w:r>
+              <w:rPr>
+                <w:rFonts w:ascii="PMingLiU" w:hAnsi="PMingLiU" w:eastAsia="新細明體"/>
+                <w:b/>
+                <w:sz w:val="24"/>
+              </w:rPr>
+              <w:t>主要使用者</w:t>
+            </w:r>
+          </w:p>
+        </w:tc>
+      </w:tr>
+      <w:tr>
+        <w:tc>
+          <w:tcPr>
+            <w:tcW w:type="dxa" w:w="3009"/>
+          </w:tcPr>
+          <w:p>
+            <w:r/>
+            <w:r>
+              <w:rPr>
+                <w:rFonts w:ascii="PMingLiU" w:hAnsi="PMingLiU" w:eastAsia="新細明體"/>
+                <w:b w:val="0"/>
+                <w:sz w:val="24"/>
+              </w:rPr>
+              <w:t>高</w:t>
+            </w:r>
+          </w:p>
+        </w:tc>
+        <w:tc>
+          <w:tcPr>
+            <w:tcW w:type="dxa" w:w="3009"/>
+          </w:tcPr>
+          <w:p>
+            <w:r/>
+            <w:r>
+              <w:rPr>
+                <w:rFonts w:ascii="PMingLiU" w:hAnsi="PMingLiU" w:eastAsia="新細明體"/>
+                <w:b w:val="0"/>
+                <w:sz w:val="24"/>
+              </w:rPr>
+              <w:t>校內外活動申請表</w:t>
+            </w:r>
+          </w:p>
+        </w:tc>
+        <w:tc>
+          <w:tcPr>
+            <w:tcW w:type="dxa" w:w="3009"/>
+          </w:tcPr>
+          <w:p>
+            <w:r/>
+            <w:r>
+              <w:rPr>
+                <w:rFonts w:ascii="PMingLiU" w:hAnsi="PMingLiU" w:eastAsia="新細明體"/>
+                <w:b w:val="0"/>
+                <w:sz w:val="24"/>
+              </w:rPr>
+              <w:t>各科組、學會</w:t>
+            </w:r>
+          </w:p>
+        </w:tc>
+      </w:tr>
+      <w:tr>
+        <w:tc>
+          <w:tcPr>
+            <w:tcW w:type="dxa" w:w="3009"/>
+          </w:tcPr>
+          <w:p>
+            <w:r/>
+            <w:r>
+              <w:rPr>
+                <w:rFonts w:ascii="PMingLiU" w:hAnsi="PMingLiU" w:eastAsia="新細明體"/>
+                <w:b w:val="0"/>
+                <w:sz w:val="24"/>
+              </w:rPr>
+              <w:t>高</w:t>
+            </w:r>
+          </w:p>
+        </w:tc>
+        <w:tc>
+          <w:tcPr>
+            <w:tcW w:type="dxa" w:w="3009"/>
+          </w:tcPr>
+          <w:p>
+            <w:r/>
+            <w:r>
+              <w:rPr>
+                <w:rFonts w:ascii="PMingLiU" w:hAnsi="PMingLiU" w:eastAsia="新細明體"/>
+                <w:b w:val="0"/>
+                <w:sz w:val="24"/>
+              </w:rPr>
+              <w:t>會議紀錄整理</w:t>
+            </w:r>
+          </w:p>
+        </w:tc>
+        <w:tc>
+          <w:tcPr>
+            <w:tcW w:type="dxa" w:w="3009"/>
+          </w:tcPr>
+          <w:p>
+            <w:r/>
+            <w:r>
+              <w:rPr>
+                <w:rFonts w:ascii="PMingLiU" w:hAnsi="PMingLiU" w:eastAsia="新細明體"/>
+                <w:b w:val="0"/>
+                <w:sz w:val="24"/>
+              </w:rPr>
+              <w:t>科組、行政</w:t>
+            </w:r>
+          </w:p>
+        </w:tc>
+      </w:tr>
+      <w:tr>
+        <w:tc>
+          <w:tcPr>
+            <w:tcW w:type="dxa" w:w="3009"/>
+          </w:tcPr>
+          <w:p>
+            <w:r/>
+            <w:r>
+              <w:rPr>
+                <w:rFonts w:ascii="PMingLiU" w:hAnsi="PMingLiU" w:eastAsia="新細明體"/>
+                <w:b w:val="0"/>
+                <w:sz w:val="24"/>
+              </w:rPr>
+              <w:t>高</w:t>
+            </w:r>
+          </w:p>
+        </w:tc>
+        <w:tc>
+          <w:tcPr>
+            <w:tcW w:type="dxa" w:w="3009"/>
+          </w:tcPr>
+          <w:p>
+            <w:r/>
+            <w:r>
+              <w:rPr>
+                <w:rFonts w:ascii="PMingLiU" w:hAnsi="PMingLiU" w:eastAsia="新細明體"/>
+                <w:b w:val="0"/>
+                <w:sz w:val="24"/>
+              </w:rPr>
+              <w:t>紙本功課掃描後 Teams 整理與回饋支援</w:t>
+            </w:r>
+          </w:p>
+        </w:tc>
+        <w:tc>
+          <w:tcPr>
+            <w:tcW w:type="dxa" w:w="3009"/>
+          </w:tcPr>
+          <w:p>
+            <w:r/>
+            <w:r>
+              <w:rPr>
+                <w:rFonts w:ascii="PMingLiU" w:hAnsi="PMingLiU" w:eastAsia="新細明體"/>
+                <w:b w:val="0"/>
+                <w:sz w:val="24"/>
+              </w:rPr>
+              <w:t>英/數/音試點</w:t>
+            </w:r>
+          </w:p>
+        </w:tc>
+      </w:tr>
+      <w:tr>
+        <w:tc>
+          <w:tcPr>
+            <w:tcW w:type="dxa" w:w="3009"/>
+          </w:tcPr>
+          <w:p>
+            <w:r/>
+            <w:r>
+              <w:rPr>
+                <w:rFonts w:ascii="PMingLiU" w:hAnsi="PMingLiU" w:eastAsia="新細明體"/>
+                <w:b w:val="0"/>
+                <w:sz w:val="24"/>
+              </w:rPr>
+              <w:t>中</w:t>
+            </w:r>
+          </w:p>
+        </w:tc>
+        <w:tc>
+          <w:tcPr>
+            <w:tcW w:type="dxa" w:w="3009"/>
+          </w:tcPr>
+          <w:p>
+            <w:r/>
+            <w:r>
+              <w:rPr>
+                <w:rFonts w:ascii="PMingLiU" w:hAnsi="PMingLiU" w:eastAsia="新細明體"/>
+                <w:b w:val="0"/>
+                <w:sz w:val="24"/>
+              </w:rPr>
+              <w:t>試卷及評核相關支援</w:t>
+            </w:r>
+          </w:p>
+        </w:tc>
+        <w:tc>
+          <w:tcPr>
+            <w:tcW w:type="dxa" w:w="3009"/>
+          </w:tcPr>
+          <w:p>
+            <w:r/>
+            <w:r>
+              <w:rPr>
+                <w:rFonts w:ascii="PMingLiU" w:hAnsi="PMingLiU" w:eastAsia="新細明體"/>
+                <w:b w:val="0"/>
+                <w:sz w:val="24"/>
+              </w:rPr>
+              <w:t>試點科</w:t>
+            </w:r>
+          </w:p>
+        </w:tc>
+      </w:tr>
+      <w:tr>
+        <w:tc>
+          <w:tcPr>
+            <w:tcW w:type="dxa" w:w="3009"/>
+          </w:tcPr>
+          <w:p>
+            <w:r/>
+            <w:r>
+              <w:rPr>
+                <w:rFonts w:ascii="PMingLiU" w:hAnsi="PMingLiU" w:eastAsia="新細明體"/>
+                <w:b w:val="0"/>
+                <w:sz w:val="24"/>
+              </w:rPr>
+              <w:t>中</w:t>
+            </w:r>
+          </w:p>
+        </w:tc>
+        <w:tc>
+          <w:tcPr>
+            <w:tcW w:type="dxa" w:w="3009"/>
+          </w:tcPr>
+          <w:p>
+            <w:r/>
+            <w:r>
+              <w:rPr>
+                <w:rFonts w:ascii="PMingLiU" w:hAnsi="PMingLiU" w:eastAsia="新細明體"/>
+                <w:b w:val="0"/>
+                <w:sz w:val="24"/>
+              </w:rPr>
+              <w:t>會議錄音轉文字（再整理為紀錄）</w:t>
+            </w:r>
+          </w:p>
+        </w:tc>
+        <w:tc>
+          <w:tcPr>
+            <w:tcW w:type="dxa" w:w="3009"/>
+          </w:tcPr>
+          <w:p>
+            <w:r/>
+            <w:r>
+              <w:rPr>
+                <w:rFonts w:ascii="PMingLiU" w:hAnsi="PMingLiU" w:eastAsia="新細明體"/>
+                <w:b w:val="0"/>
+                <w:sz w:val="24"/>
+              </w:rPr>
+              <w:t>科組、行政</w:t>
+            </w:r>
+          </w:p>
+        </w:tc>
+      </w:tr>
+    </w:tbl>
     <w:p>
       <w:r>
         <w:rPr>
@@ -815,7 +1494,7 @@
                 <w:b w:val="0"/>
                 <w:sz w:val="24"/>
               </w:rPr>
-              <w:t>學生紙本功課難以及時上載平台</w:t>
+              <w:t>學生紙本功課難以及時上載</w:t>
             </w:r>
           </w:p>
         </w:tc>
@@ -946,7 +1625,7 @@
           <w:b/>
           <w:sz w:val="24"/>
         </w:rPr>
-        <w:t>4.2 掃描設備配置（按場景分類）</w:t>
+        <w:t>4.2 掃描設備配置（按場景）</w:t>
       </w:r>
     </w:p>
     <w:tbl>
@@ -1056,7 +1735,7 @@
                 <w:b w:val="0"/>
                 <w:sz w:val="24"/>
               </w:rPr>
-              <w:t>便攜式/饋纸式高速掃描器（1–2 部）</w:t>
+              <w:t>便攜式/饋紙式高速掃描器（1–2 部）</w:t>
             </w:r>
           </w:p>
         </w:tc>
@@ -1072,7 +1751,7 @@
                 <w:b w:val="0"/>
                 <w:sz w:val="24"/>
               </w:rPr>
-              <w:t>試點科組或流動教具車</w:t>
+              <w:t>試點科或流動教具車</w:t>
             </w:r>
           </w:p>
         </w:tc>
@@ -1088,7 +1767,7 @@
                 <w:b w:val="0"/>
                 <w:sz w:val="24"/>
               </w:rPr>
-              <w:t>堂上小測、工作紙即時掃描</w:t>
+              <w:t>堂上小測、工作紙</w:t>
             </w:r>
           </w:p>
         </w:tc>
@@ -1122,7 +1801,7 @@
                 <w:b w:val="0"/>
                 <w:sz w:val="24"/>
               </w:rPr>
-              <w:t>高速批量掃描器（ADF，每試點科 1 部）</w:t>
+              <w:t>高速批量掃描器 × 3</w:t>
             </w:r>
           </w:p>
         </w:tc>
@@ -1138,7 +1817,7 @@
                 <w:b w:val="0"/>
                 <w:sz w:val="24"/>
               </w:rPr>
-              <w:t>英文、數學、音樂科辦</w:t>
+              <w:t>英/數/音科辦</w:t>
             </w:r>
           </w:p>
         </w:tc>
@@ -1154,7 +1833,7 @@
                 <w:b w:val="0"/>
                 <w:sz w:val="24"/>
               </w:rPr>
-              <w:t>全班作業、週測批次處理</w:t>
+              <w:t>全班作業、週測</w:t>
             </w:r>
           </w:p>
         </w:tc>
@@ -1188,7 +1867,7 @@
                 <w:b w:val="0"/>
                 <w:sz w:val="24"/>
               </w:rPr>
-              <w:t>高容量批量掃描器（1 部）</w:t>
+              <w:t>高容量批量掃描器 × 1</w:t>
             </w:r>
           </w:p>
         </w:tc>
@@ -1204,7 +1883,7 @@
                 <w:b w:val="0"/>
                 <w:sz w:val="24"/>
               </w:rPr>
-              <w:t>影印室或 IT 支援區</w:t>
+              <w:t>影印室或 IT 區</w:t>
             </w:r>
           </w:p>
         </w:tc>
@@ -1233,7 +1912,7 @@
           <w:b w:val="0"/>
           <w:sz w:val="24"/>
         </w:rPr>
-        <w:t>選購原則：支援雙面饋纸、批量掃描、PDF/JPG 輸出、可配合 OneDrive/Teams 自動同步；優先選擇學校 IT 可支援的型號。</w:t>
+        <w:t>選購原則：雙面饋紙、批量掃描、PDF/JPG 輸出、可配合 OneDrive/Teams 同步；優先學校 IT 可支援型號。</w:t>
       </w:r>
     </w:p>
     <w:p>
@@ -1243,7 +1922,7 @@
           <w:b/>
           <w:sz w:val="24"/>
         </w:rPr>
-        <w:t>4.3 Teams 上載標準流程（SOP 草案）</w:t>
+        <w:t>4.3 Teams 上載 SOP（草案）</w:t>
       </w:r>
     </w:p>
     <w:p>
@@ -1269,7 +1948,7 @@
           <w:b w:val="0"/>
           <w:sz w:val="24"/>
         </w:rPr>
-        <w:t>按班別放入掃描器（預設命名：`科目_班別_日期_課題`）</w:t>
+        <w:t>按班別掃描（命名：`科目_班別_日期_課題`）</w:t>
       </w:r>
     </w:p>
     <w:p>
@@ -1282,7 +1961,7 @@
           <w:b w:val="0"/>
           <w:sz w:val="24"/>
         </w:rPr>
-        <w:t>掃描完成 → 自動/半自動上載至 Teams 對應 Assignment 或 Class Files 資料夾</w:t>
+        <w:t>上載至 Teams Assignment 或 Class Files</w:t>
       </w:r>
     </w:p>
     <w:p>
@@ -1295,7 +1974,7 @@
           <w:b w:val="0"/>
           <w:sz w:val="24"/>
         </w:rPr>
-        <w:t>教師在 Teams 查閱；需要時以 Cursor Agent 生成分項回饋草稿</w:t>
+        <w:t>教師查閱；需要時以合規 AI 工具生成分項回饋草稿</w:t>
       </w:r>
     </w:p>
     <w:p>
@@ -1308,7 +1987,7 @@
           <w:b w:val="0"/>
           <w:sz w:val="24"/>
         </w:rPr>
-        <w:t>批改完成 → 回饋存檔於 Teams，作為學情分析依據</w:t>
+        <w:t>回饋存檔於 Teams，作學情分析依據</w:t>
       </w:r>
     </w:p>
     <w:p>
@@ -1318,7 +1997,7 @@
           <w:b/>
           <w:sz w:val="24"/>
         </w:rPr>
-        <w:t>4.4 與 AI 輔助批改的銜接</w:t>
+        <w:t>4.4 AI 輔助與私隱</w:t>
       </w:r>
     </w:p>
     <w:p>
@@ -1331,37 +2010,7 @@
           <w:b w:val="0"/>
           <w:sz w:val="24"/>
         </w:rPr>
-        <w:t>掃描檔上載 Teams 後，教師可運用合規 AI 工具（如 Copilot、Gemini 等校本授權方案）輔助：</w:t>
-      </w:r>
-    </w:p>
-    <w:p>
-      <w:r>
-        <w:rPr>
-          <w:rFonts w:ascii="PMingLiU" w:hAnsi="PMingLiU" w:eastAsia="新細明體"/>
-          <w:b w:val="0"/>
-          <w:sz w:val="24"/>
-        </w:rPr>
-        <w:t xml:space="preserve">  - 手寫/印刷體識別</w:t>
-      </w:r>
-    </w:p>
-    <w:p>
-      <w:r>
-        <w:rPr>
-          <w:rFonts w:ascii="PMingLiU" w:hAnsi="PMingLiU" w:eastAsia="新細明體"/>
-          <w:b w:val="0"/>
-          <w:sz w:val="24"/>
-        </w:rPr>
-        <w:t xml:space="preserve">  - 按 Rubric 生成分項回饋建議</w:t>
-      </w:r>
-    </w:p>
-    <w:p>
-      <w:r>
-        <w:rPr>
-          <w:rFonts w:ascii="PMingLiU" w:hAnsi="PMingLiU" w:eastAsia="新細明體"/>
-          <w:b w:val="0"/>
-          <w:sz w:val="24"/>
-        </w:rPr>
-        <w:t xml:space="preserve">  - 整理全班常見錯誤</w:t>
+        <w:t>掃描檔在 Teams 校內環境處理</w:t>
       </w:r>
     </w:p>
     <w:p>
@@ -1374,7 +2023,20 @@
           <w:b w:val="0"/>
           <w:sz w:val="24"/>
         </w:rPr>
-        <w:t>私隱原則：學生個人資料只在 Teams 校內環境處理；不把可識別個人資料上載至不受控的公開 AI 平台</w:t>
+        <w:t>可選用合規 AI 工具輔助 Rubric 回饋（不上載可識別學生個人資料至不受控平台）</w:t>
+      </w:r>
+    </w:p>
+    <w:p>
+      <w:pPr>
+        <w:pStyle w:val="ListBullet"/>
+      </w:pPr>
+      <w:r>
+        <w:rPr>
+          <w:rFonts w:ascii="PMingLiU" w:hAnsi="PMingLiU" w:eastAsia="新細明體"/>
+          <w:b w:val="0"/>
+          <w:sz w:val="24"/>
+        </w:rPr>
+        <w:t>涉及系統對接的設定，由學校統一管理，不散落各同事電腦</w:t>
       </w:r>
     </w:p>
     <w:p>
@@ -1384,7 +2046,208 @@
           <w:b/>
           <w:sz w:val="24"/>
         </w:rPr>
-        <w:t>五、教育局承諾對照（兩年內完成）</w:t>
+        <w:t>五、可持續與交接</w:t>
+      </w:r>
+    </w:p>
+    <w:p>
+      <w:r>
+        <w:rPr>
+          <w:rFonts w:ascii="PMingLiU" w:hAnsi="PMingLiU" w:eastAsia="新細明體"/>
+          <w:b w:val="0"/>
+          <w:sz w:val="24"/>
+        </w:rPr>
+        <w:t>本校採 學校資產 + 多人核心組 模式，避免過度依賴個別同事：</w:t>
+      </w:r>
+    </w:p>
+    <w:tbl>
+      <w:tblPr>
+        <w:tblStyle w:val="TableGrid"/>
+        <w:tblW w:type="auto" w:w="0"/>
+        <w:tblLook w:firstColumn="1" w:firstRow="1" w:lastColumn="0" w:lastRow="0" w:noHBand="0" w:noVBand="1" w:val="04A0"/>
+      </w:tblPr>
+      <w:tblGrid>
+        <w:gridCol w:w="4513"/>
+        <w:gridCol w:w="4513"/>
+      </w:tblGrid>
+      <w:tr>
+        <w:tc>
+          <w:tcPr>
+            <w:tcW w:type="dxa" w:w="4513"/>
+          </w:tcPr>
+          <w:p>
+            <w:r/>
+            <w:r>
+              <w:rPr>
+                <w:rFonts w:ascii="PMingLiU" w:hAnsi="PMingLiU" w:eastAsia="新細明體"/>
+                <w:b/>
+                <w:sz w:val="24"/>
+              </w:rPr>
+              <w:t>機制</w:t>
+            </w:r>
+          </w:p>
+        </w:tc>
+        <w:tc>
+          <w:tcPr>
+            <w:tcW w:type="dxa" w:w="4513"/>
+          </w:tcPr>
+          <w:p>
+            <w:r/>
+            <w:r>
+              <w:rPr>
+                <w:rFonts w:ascii="PMingLiU" w:hAnsi="PMingLiU" w:eastAsia="新細明體"/>
+                <w:b/>
+                <w:sz w:val="24"/>
+              </w:rPr>
+              <w:t>說明</w:t>
+            </w:r>
+          </w:p>
+        </w:tc>
+      </w:tr>
+      <w:tr>
+        <w:tc>
+          <w:tcPr>
+            <w:tcW w:type="dxa" w:w="4513"/>
+          </w:tcPr>
+          <w:p>
+            <w:r/>
+            <w:r>
+              <w:rPr>
+                <w:rFonts w:ascii="PMingLiU" w:hAnsi="PMingLiU" w:eastAsia="新細明體"/>
+                <w:b w:val="0"/>
+                <w:sz w:val="24"/>
+              </w:rPr>
+              <w:t>校本資源庫</w:t>
+            </w:r>
+          </w:p>
+        </w:tc>
+        <w:tc>
+          <w:tcPr>
+            <w:tcW w:type="dxa" w:w="4513"/>
+          </w:tcPr>
+          <w:p>
+            <w:r/>
+            <w:r>
+              <w:rPr>
+                <w:rFonts w:ascii="PMingLiU" w:hAnsi="PMingLiU" w:eastAsia="新細明體"/>
+                <w:b w:val="0"/>
+                <w:sz w:val="24"/>
+              </w:rPr>
+              <w:t>工具、範本、SOP 集中保存；人員更替仍可延續</w:t>
+            </w:r>
+          </w:p>
+        </w:tc>
+      </w:tr>
+      <w:tr>
+        <w:tc>
+          <w:tcPr>
+            <w:tcW w:type="dxa" w:w="4513"/>
+          </w:tcPr>
+          <w:p>
+            <w:r/>
+            <w:r>
+              <w:rPr>
+                <w:rFonts w:ascii="PMingLiU" w:hAnsi="PMingLiU" w:eastAsia="新細明體"/>
+                <w:b w:val="0"/>
+                <w:sz w:val="24"/>
+              </w:rPr>
+              <w:t>核心組 4–5 人</w:t>
+            </w:r>
+          </w:p>
+        </w:tc>
+        <w:tc>
+          <w:tcPr>
+            <w:tcW w:type="dxa" w:w="4513"/>
+          </w:tcPr>
+          <w:p>
+            <w:r/>
+            <w:r>
+              <w:rPr>
+                <w:rFonts w:ascii="PMingLiU" w:hAnsi="PMingLiU" w:eastAsia="新細明體"/>
+                <w:b w:val="0"/>
+                <w:sz w:val="24"/>
+              </w:rPr>
+              <w:t>每週同步；至少 2 人具備維護能力</w:t>
+            </w:r>
+          </w:p>
+        </w:tc>
+      </w:tr>
+      <w:tr>
+        <w:tc>
+          <w:tcPr>
+            <w:tcW w:type="dxa" w:w="4513"/>
+          </w:tcPr>
+          <w:p>
+            <w:r/>
+            <w:r>
+              <w:rPr>
+                <w:rFonts w:ascii="PMingLiU" w:hAnsi="PMingLiU" w:eastAsia="新細明體"/>
+                <w:b w:val="0"/>
+                <w:sz w:val="24"/>
+              </w:rPr>
+              <w:t>中文 SOP</w:t>
+            </w:r>
+          </w:p>
+        </w:tc>
+        <w:tc>
+          <w:tcPr>
+            <w:tcW w:type="dxa" w:w="4513"/>
+          </w:tcPr>
+          <w:p>
+            <w:r/>
+            <w:r>
+              <w:rPr>
+                <w:rFonts w:ascii="PMingLiU" w:hAnsi="PMingLiU" w:eastAsia="新細明體"/>
+                <w:b w:val="0"/>
+                <w:sz w:val="24"/>
+              </w:rPr>
+              <w:t>普通教師按步驟操作，無需技術背景</w:t>
+            </w:r>
+          </w:p>
+        </w:tc>
+      </w:tr>
+      <w:tr>
+        <w:tc>
+          <w:tcPr>
+            <w:tcW w:type="dxa" w:w="4513"/>
+          </w:tcPr>
+          <w:p>
+            <w:r/>
+            <w:r>
+              <w:rPr>
+                <w:rFonts w:ascii="PMingLiU" w:hAnsi="PMingLiU" w:eastAsia="新細明體"/>
+                <w:b w:val="0"/>
+                <w:sz w:val="24"/>
+              </w:rPr>
+              <w:t>寫入 SDP / 周年計劃</w:t>
+            </w:r>
+          </w:p>
+        </w:tc>
+        <w:tc>
+          <w:tcPr>
+            <w:tcW w:type="dxa" w:w="4513"/>
+          </w:tcPr>
+          <w:p>
+            <w:r/>
+            <w:r>
+              <w:rPr>
+                <w:rFonts w:ascii="PMingLiU" w:hAnsi="PMingLiU" w:eastAsia="新細明體"/>
+                <w:b w:val="0"/>
+                <w:sz w:val="24"/>
+              </w:rPr>
+              <w:t>「發展人工智能賦能教育」為正式校本項目</w:t>
+            </w:r>
+          </w:p>
+        </w:tc>
+      </w:tr>
+    </w:tbl>
+    <w:p>
+      <w:r>
+        <w:rPr>
+          <w:rFonts w:ascii="PMingLiU" w:hAnsi="PMingLiU" w:eastAsia="新細明體"/>
+          <w:b/>
+          <w:sz w:val="24"/>
+        </w:rPr>
+        <w:t>六、教育局承諾對照（兩年內完成）</w:t>
       </w:r>
     </w:p>
     <w:tbl>
@@ -1443,7 +2306,7 @@
                 <w:b/>
                 <w:sz w:val="24"/>
               </w:rPr>
-              <w:t>預期完成時間</w:t>
+              <w:t>預期完成</w:t>
             </w:r>
           </w:p>
         </w:tc>
@@ -1577,7 +2440,7 @@
                 <w:b w:val="0"/>
                 <w:sz w:val="24"/>
               </w:rPr>
-              <w:t>三科各 1 次（可錄影公開課）</w:t>
+              <w:t>三科各 1 次（可錄影）</w:t>
             </w:r>
           </w:p>
         </w:tc>
@@ -1627,7 +2490,7 @@
                 <w:b w:val="0"/>
                 <w:sz w:val="24"/>
               </w:rPr>
-              <w:t>校內 3 場（展示 Teams 上載 + Agent 共建成果）</w:t>
+              <w:t>展示 Teams 上載及 AI 輔助教學成果</w:t>
             </w:r>
           </w:p>
         </w:tc>
@@ -1677,7 +2540,7 @@
                 <w:b w:val="0"/>
                 <w:sz w:val="24"/>
               </w:rPr>
-              <w:t>AI 素養工作坊 + 跨科 AI 創作比賽</w:t>
+              <w:t>AI 素養工作坊 + 跨科創作比賽</w:t>
             </w:r>
           </w:p>
         </w:tc>
@@ -1706,7 +2569,7 @@
           <w:b/>
           <w:sz w:val="24"/>
         </w:rPr>
-        <w:t>5.1 六個教學例子/資源（初稿）</w:t>
+        <w:t>6.1 六個教學例子/資源（初稿）</w:t>
       </w:r>
     </w:p>
     <w:tbl>
@@ -1848,7 +2711,7 @@
                 <w:b w:val="0"/>
                 <w:sz w:val="24"/>
               </w:rPr>
-              <w:t>展示 O2O 批改完整流程</w:t>
+              <w:t>完整 O2O 批改流程</w:t>
             </w:r>
           </w:p>
         </w:tc>
@@ -1980,7 +2843,7 @@
                 <w:b w:val="0"/>
                 <w:sz w:val="24"/>
               </w:rPr>
-              <w:t>不直接給答案的分步提示</w:t>
+              <w:t>分步提示，不直接給答案</w:t>
             </w:r>
           </w:p>
         </w:tc>
@@ -2030,7 +2893,7 @@
                 <w:b w:val="0"/>
                 <w:sz w:val="24"/>
               </w:rPr>
-              <w:t>弱項診斷題庫（按 Teams 批改數據整理）</w:t>
+              <w:t>弱項診斷題庫（按 Teams 數據整理）</w:t>
             </w:r>
           </w:p>
         </w:tc>
@@ -2191,7 +3054,7 @@
           <w:b/>
           <w:sz w:val="24"/>
         </w:rPr>
-        <w:t>六、兩年推行時間表</w:t>
+        <w:t>七、兩年推行時間表</w:t>
       </w:r>
     </w:p>
     <w:p>
@@ -2201,7 +3064,7 @@
           <w:b/>
           <w:sz w:val="24"/>
         </w:rPr>
-        <w:t>2026/27 學年（第一年：奠基 + 達標）</w:t>
+        <w:t>2026/27（第一年：奠基 + 達標）</w:t>
       </w:r>
     </w:p>
     <w:tbl>
@@ -2277,7 +3140,7 @@
                 <w:b w:val="0"/>
                 <w:sz w:val="24"/>
               </w:rPr>
-              <w:t>完成掃描器採購、Cursor 訂閱開通、Teams 資料夾結構設定</w:t>
+              <w:t>掃描器採購；Cursor 開通；Teams 資料夾結構；首批校本工具試行</w:t>
             </w:r>
           </w:p>
         </w:tc>
@@ -2295,7 +3158,7 @@
                 <w:b w:val="0"/>
                 <w:sz w:val="24"/>
               </w:rPr>
-              <w:t>2026/27 上學期</w:t>
+              <w:t>上學期</w:t>
             </w:r>
           </w:p>
         </w:tc>
@@ -2311,7 +3174,7 @@
                 <w:b w:val="0"/>
                 <w:sz w:val="24"/>
               </w:rPr>
-              <w:t>三科試點 O2O 流程；共建教師開始開發首批 Agent</w:t>
+              <w:t>三科 O2O 試點；完成活動表、會議紀錄等首批應用</w:t>
             </w:r>
           </w:p>
         </w:tc>
@@ -2329,7 +3192,7 @@
                 <w:b w:val="0"/>
                 <w:sz w:val="24"/>
               </w:rPr>
-              <w:t>2026/27 下學期</w:t>
+              <w:t>下學期</w:t>
             </w:r>
           </w:p>
         </w:tc>
@@ -2345,7 +3208,7 @@
                 <w:b w:val="0"/>
                 <w:sz w:val="24"/>
               </w:rPr>
-              <w:t>完成 6 個例子、3 課公開課、2 場分享會、1 個學生活動</w:t>
+              <w:t>完成 6 例子、3 公開課、2 場分享會、1 個學生活動</w:t>
             </w:r>
           </w:p>
         </w:tc>
@@ -2379,7 +3242,7 @@
                 <w:b w:val="0"/>
                 <w:sz w:val="24"/>
               </w:rPr>
-              <w:t>整理 SOP、Agent 清單；準備中期報告資料</w:t>
+              <w:t>SOP 定稿；整理中期報告資料</w:t>
             </w:r>
           </w:p>
         </w:tc>
@@ -2392,7 +3255,7 @@
           <w:b/>
           <w:sz w:val="24"/>
         </w:rPr>
-        <w:t>2027/28 學年（第二年：擴散 + 鞏固）</w:t>
+        <w:t>2027/28（第二年：擴散 + 鞏固）</w:t>
       </w:r>
     </w:p>
     <w:tbl>
@@ -2452,7 +3315,7 @@
                 <w:b w:val="0"/>
                 <w:sz w:val="24"/>
               </w:rPr>
-              <w:t>2027/28 上學期</w:t>
+              <w:t>上學期</w:t>
             </w:r>
           </w:p>
         </w:tc>
@@ -2468,7 +3331,7 @@
                 <w:b w:val="0"/>
                 <w:sz w:val="24"/>
               </w:rPr>
-              <w:t>向其他科組推廣 Teams 上載流程；第二批共建教師加入</w:t>
+              <w:t>推廣 Teams 流程至更多科；增校本應用；教師培訓</w:t>
             </w:r>
           </w:p>
         </w:tc>
@@ -2486,7 +3349,7 @@
                 <w:b w:val="0"/>
                 <w:sz w:val="24"/>
               </w:rPr>
-              <w:t>2027/28 下學期</w:t>
+              <w:t>下學期</w:t>
             </w:r>
           </w:p>
         </w:tc>
@@ -2502,7 +3365,7 @@
                 <w:b w:val="0"/>
                 <w:sz w:val="24"/>
               </w:rPr>
-              <w:t>完成第 3 場分享會、第 2 個學生活動；整理總結報告</w:t>
+              <w:t>第 3 場分享會、第 2 個學生活動；總結報告</w:t>
             </w:r>
           </w:p>
         </w:tc>
@@ -2536,7 +3399,7 @@
                 <w:b w:val="0"/>
                 <w:sz w:val="24"/>
               </w:rPr>
-              <w:t>確保撥款使用完畢；提交總結報告（2028-09-30 前）</w:t>
+              <w:t>撥款使用完畢；提交總結報告（2028-09-30 前）</w:t>
             </w:r>
           </w:p>
         </w:tc>
@@ -2549,7 +3412,7 @@
           <w:b/>
           <w:sz w:val="24"/>
         </w:rPr>
-        <w:t>七、採購與預算分配（總額 $500,000）</w:t>
+        <w:t>八、採購與預算分配（總額 $500,000，可按報價微調）</w:t>
       </w:r>
     </w:p>
     <w:tbl>
@@ -2774,7 +3637,7 @@
                 <w:b w:val="0"/>
                 <w:sz w:val="24"/>
               </w:rPr>
-              <w:t>科辦高速批量掃描器 × 3（英/數/音）</w:t>
+              <w:t>科辦高速批量掃描器 × 3</w:t>
             </w:r>
           </w:p>
         </w:tc>
@@ -2806,7 +3669,7 @@
                 <w:b w:val="0"/>
                 <w:sz w:val="24"/>
               </w:rPr>
-              <w:t>全班作業批次處理</w:t>
+              <w:t>英/數/音科辦</w:t>
             </w:r>
           </w:p>
         </w:tc>
@@ -2856,7 +3719,7 @@
                 <w:b w:val="0"/>
                 <w:sz w:val="24"/>
               </w:rPr>
-              <w:t>共用高容量批量掃描器 × 1</w:t>
+              <w:t>共用高容量掃描器 × 1</w:t>
             </w:r>
           </w:p>
         </w:tc>
@@ -2888,7 +3751,7 @@
                 <w:b w:val="0"/>
                 <w:sz w:val="24"/>
               </w:rPr>
-              <w:t>影印室/IT 區共用</w:t>
+              <w:t>影印室/IT 區</w:t>
             </w:r>
           </w:p>
         </w:tc>
@@ -2922,7 +3785,7 @@
                 <w:b w:val="0"/>
                 <w:sz w:val="24"/>
               </w:rPr>
-              <w:t>软件</w:t>
+              <w:t>軟件</w:t>
             </w:r>
           </w:p>
         </w:tc>
@@ -2938,7 +3801,7 @@
                 <w:b w:val="0"/>
                 <w:sz w:val="24"/>
               </w:rPr>
-              <w:t>Cursor Team/Business 一年 × 12–15 位</w:t>
+              <w:t>Cursor 一年 × 3–4 位（核心組）</w:t>
             </w:r>
           </w:p>
         </w:tc>
@@ -2954,7 +3817,7 @@
                 <w:b w:val="0"/>
                 <w:sz w:val="24"/>
               </w:rPr>
-              <w:t>120,000</w:t>
+              <w:t>40,000</w:t>
             </w:r>
           </w:p>
         </w:tc>
@@ -2970,7 +3833,7 @@
                 <w:b w:val="0"/>
                 <w:sz w:val="24"/>
               </w:rPr>
-              <w:t>共建教師 Agent 開發</w:t>
+              <w:t>核心組共建工具</w:t>
             </w:r>
           </w:p>
         </w:tc>
@@ -3004,7 +3867,7 @@
                 <w:b w:val="0"/>
                 <w:sz w:val="24"/>
               </w:rPr>
-              <w:t>软件/平台</w:t>
+              <w:t>軟件/平台</w:t>
             </w:r>
           </w:p>
         </w:tc>
@@ -3020,7 +3883,7 @@
                 <w:b w:val="0"/>
                 <w:sz w:val="24"/>
               </w:rPr>
-              <w:t>Teams 整合輔助工具、OCR/AI API 額度（合規方案）</w:t>
+              <w:t>OCR/AI 服務額度、Teams 整合輔助</w:t>
             </w:r>
           </w:p>
         </w:tc>
@@ -3052,7 +3915,7 @@
                 <w:b w:val="0"/>
                 <w:sz w:val="24"/>
               </w:rPr>
-              <w:t>支援掃描後處理與回饋生成</w:t>
+              <w:t>掃描後處理與回饋</w:t>
             </w:r>
           </w:p>
         </w:tc>
@@ -3102,7 +3965,7 @@
                 <w:b w:val="0"/>
                 <w:sz w:val="24"/>
               </w:rPr>
-              <w:t>School-Agent-OS 共用工具整合與部署</w:t>
+              <w:t>校本工具開發、部署及試行</w:t>
             </w:r>
           </w:p>
         </w:tc>
@@ -3118,7 +3981,7 @@
                 <w:b w:val="0"/>
                 <w:sz w:val="24"/>
               </w:rPr>
-              <w:t>50,000</w:t>
+              <w:t>130,000</w:t>
             </w:r>
           </w:p>
         </w:tc>
@@ -3134,7 +3997,7 @@
                 <w:b w:val="0"/>
                 <w:sz w:val="24"/>
               </w:rPr>
-              <w:t>把 Agent 沉澱為可重用工具</w:t>
+              <w:t>校本人工智能應用方案</w:t>
             </w:r>
           </w:p>
         </w:tc>
@@ -3216,7 +4079,7 @@
                 <w:b w:val="0"/>
                 <w:sz w:val="24"/>
               </w:rPr>
-              <w:t>達成最少 2 個學生活動</w:t>
+              <w:t>最少 2 個活動</w:t>
             </w:r>
           </w:p>
         </w:tc>
@@ -3318,7 +4181,7 @@
           <w:b/>
           <w:sz w:val="24"/>
         </w:rPr>
-        <w:t>八、管理與合規</w:t>
+        <w:t>九、管理與合規</w:t>
       </w:r>
     </w:p>
     <w:p>
@@ -3331,7 +4194,7 @@
           <w:b w:val="0"/>
           <w:sz w:val="24"/>
         </w:rPr>
-        <w:t>帳目：備存獨立分類帳目，單據保留不少於七年</w:t>
+        <w:t>帳目：獨立分類帳目；單據保留不少於七年</w:t>
       </w:r>
     </w:p>
     <w:p>
@@ -3344,7 +4207,7 @@
           <w:b w:val="0"/>
           <w:sz w:val="24"/>
         </w:rPr>
-        <w:t>私隱：學生資料只在 Teams 校內環境處理；共建 Agent 須遵守最少必要資料原則</w:t>
+        <w:t>私隱：學生資料只在 Teams 及校內合規環境處理；遵守最少必要資料原則</w:t>
       </w:r>
     </w:p>
     <w:p>
@@ -3357,7 +4220,7 @@
           <w:b w:val="0"/>
           <w:sz w:val="24"/>
         </w:rPr>
-        <w:t>採購：按資助學校採購程序及教育局相關通告執行</w:t>
+        <w:t>採購：按資助學校採購程序執行</w:t>
       </w:r>
     </w:p>
     <w:p>
@@ -3380,7 +4243,7 @@
           <w:b/>
           <w:sz w:val="24"/>
         </w:rPr>
-        <w:t>九、預期成效</w:t>
+        <w:t>十、預期成效</w:t>
       </w:r>
     </w:p>
     <w:p>
@@ -3393,7 +4256,7 @@
           <w:b w:val="0"/>
           <w:sz w:val="24"/>
         </w:rPr>
-        <w:t>短期（2026/27）：三科建立穩定「紙本→Teams→AI 回饋」流程；12–15 位共建教師掌握 Cursor 開發校本 Agent</w:t>
+        <w:t>2026/27：三科建立「紙本→Teams→AI 回饋」流程；完成不少於 2 項校本應用；核心組運作穩定</w:t>
       </w:r>
     </w:p>
     <w:p>
@@ -3406,7 +4269,7 @@
           <w:b w:val="0"/>
           <w:sz w:val="24"/>
         </w:rPr>
-        <w:t>中期（2027/28）：流程推廣至更多科組；School-Agent-OS 累積可複用工具清單</w:t>
+        <w:t>2027/28：校本應用增至 5 項以上；更多科組採用 Teams 標準流程</w:t>
       </w:r>
     </w:p>
     <w:p>
@@ -3419,7 +4282,7 @@
           <w:b w:val="0"/>
           <w:sz w:val="24"/>
         </w:rPr>
-        <w:t>長遠：即使 Cursor 訂閱期滿，已沉澱的工具與 SOP 仍可持續運作；Teams 上載習慣成為校本常規</w:t>
+        <w:t>長遠：範本與 SOP 留在校內；人員更替有文檔與核心組承接</w:t>
       </w:r>
     </w:p>
     <w:p>
@@ -3430,6 +4293,16 @@
           <w:sz w:val="24"/>
         </w:rPr>
         <w:t>*參考文件：教育局通函第 221/2025 號、《中小學數字教育發展藍圖》及附篇（見 `Administrative/EDB/` 資料夾）*</w:t>
+      </w:r>
+    </w:p>
+    <w:p>
+      <w:r>
+        <w:rPr>
+          <w:rFonts w:ascii="PMingLiU" w:hAnsi="PMingLiU" w:eastAsia="新細明體"/>
+          <w:b w:val="0"/>
+          <w:sz w:val="24"/>
+        </w:rPr>
+        <w:t>*本計劃書為暫定方案；細節將按試點情況更新。*</w:t>
       </w:r>
     </w:p>
     <w:sectPr>

</xml_diff>